<commit_message>
Update resume: 1-inch margins, drop high school entries, new LinkedIn, remove locations
- Set page margins to 1 inch on all sides
- Remove high school extracurricular entries (Broadcast Director, FIRST FTC
  Robotics, Sound Engineer) tied to Carmel Catholic High School
- Update LinkedIn URL to linkedin.com/in/alejandroe06
- Remove city/state locations from education and experience entries

Co-Authored-By: Claude Sonnet 5 <noreply@anthropic.com>
Claude-Session: https://claude.ai/code/session_0186boHx8eujw37m6nFR9HbD
</commit_message>
<xml_diff>
--- a/Alejandro Escamilla - Resume.docx
+++ b/Alejandro Escamilla - Resume.docx
@@ -32,7 +32,7 @@
           <w:szCs w:val="18"/>
           <w:lang w:val="en-US"/>
         </w:rPr>
-        <w:t>(224) 425-6301  |  ae42@illinois.edu  |  linkedin.com/in/alejandro-escamilla-512934256  |  github.com/AlejandroE25  |  aescamilla.uk</w:t>
+        <w:t>(224) 425-6301  |  ae42@illinois.edu  |  linkedin.com/in/alejandroe06  |  github.com/AlejandroE25  |  aescamilla.uk</w:t>
       </w:r>
     </w:p>
     <w:p xmlns:wp14="http://schemas.microsoft.com/office/word/2010/wordml" wp14:textId="77777777">
@@ -71,24 +71,6 @@
           <w:szCs w:val="22"/>
         </w:rPr>
         <w:t xml:space="preserve">University of Illinois Urbana-Champaign</w:t>
-      </w:r>
-      <w:r>
-        <w:rPr>
-          <w:rFonts w:ascii="Calibri" w:hAnsi="Calibri" w:eastAsia="Calibri" w:cs="Calibri"/>
-          <w:sz w:val="22"/>
-          <w:szCs w:val="22"/>
-        </w:rPr>
-        <w:t xml:space="preserve">	</w:t>
-      </w:r>
-      <w:r>
-        <w:rPr>
-          <w:rFonts w:ascii="Calibri" w:hAnsi="Calibri" w:eastAsia="Calibri" w:cs="Calibri"/>
-          <w:i/>
-          <w:iCs/>
-          <w:sz w:val="22"/>
-          <w:szCs w:val="22"/>
-        </w:rPr>
-        <w:t xml:space="preserve">Urbana, IL</w:t>
       </w:r>
     </w:p>
     <w:p xmlns:wp14="http://schemas.microsoft.com/office/word/2010/wordml" wp14:textId="77777777">
@@ -456,23 +438,6 @@
         </w:rPr>
         <w:t xml:space="preserve">University of Illinois Technology Services</w:t>
       </w:r>
-      <w:r>
-        <w:rPr>
-          <w:rFonts w:ascii="Calibri" w:hAnsi="Calibri" w:eastAsia="Calibri" w:cs="Calibri"/>
-          <w:sz w:val="22"/>
-          <w:szCs w:val="22"/>
-        </w:rPr>
-        <w:t xml:space="preserve">	</w:t>
-      </w:r>
-      <w:r>
-        <w:rPr>
-          <w:rFonts w:ascii="Calibri" w:hAnsi="Calibri" w:eastAsia="Calibri" w:cs="Calibri"/>
-          <w:color w:val="404040"/>
-          <w:sz w:val="22"/>
-          <w:szCs w:val="22"/>
-        </w:rPr>
-        <w:t xml:space="preserve">Urbana, IL</w:t>
-      </w:r>
     </w:p>
     <w:p xmlns:wp14="http://schemas.microsoft.com/office/word/2010/wordml" wp14:textId="77777777">
       <w:pPr>
@@ -525,7 +490,7 @@
           <w:sz w:val="22"/>
           <w:szCs w:val="22"/>
         </w:rPr>
-        <w:t xml:space="preserve">Broadcast Director &amp; Technical Lead</w:t>
+        <w:t xml:space="preserve">Beach Manager</w:t>
       </w:r>
       <w:r>
         <w:rPr>
@@ -543,7 +508,7 @@
           <w:sz w:val="22"/>
           <w:szCs w:val="22"/>
         </w:rPr>
-        <w:t xml:space="preserve">Jan 2022 – May 2025</w:t>
+        <w:t xml:space="preserve">May 2026 – Aug 2026</w:t>
       </w:r>
     </w:p>
     <w:p xmlns:wp14="http://schemas.microsoft.com/office/word/2010/wordml" wp14:textId="77777777">
@@ -562,24 +527,7 @@
           <w:sz w:val="22"/>
           <w:szCs w:val="22"/>
         </w:rPr>
-        <w:t xml:space="preserve">Carmel Catholic High School</w:t>
-      </w:r>
-      <w:r>
-        <w:rPr>
-          <w:rFonts w:ascii="Calibri" w:hAnsi="Calibri" w:eastAsia="Calibri" w:cs="Calibri"/>
-          <w:sz w:val="22"/>
-          <w:szCs w:val="22"/>
-        </w:rPr>
-        <w:t xml:space="preserve">	</w:t>
-      </w:r>
-      <w:r>
-        <w:rPr>
-          <w:rFonts w:ascii="Calibri" w:hAnsi="Calibri" w:eastAsia="Calibri" w:cs="Calibri"/>
-          <w:color w:val="404040"/>
-          <w:sz w:val="22"/>
-          <w:szCs w:val="22"/>
-        </w:rPr>
-        <w:t xml:space="preserve">Mundelein, IL</w:t>
+        <w:t xml:space="preserve">City of Waukegan, Waukegan Municipal Beach</w:t>
       </w:r>
     </w:p>
     <w:p xmlns:wp14="http://schemas.microsoft.com/office/word/2010/wordml" wp14:textId="77777777">
@@ -597,312 +545,6 @@
           <w:sz w:val="21"/>
           <w:szCs w:val="21"/>
         </w:rPr>
-        <w:t xml:space="preserve">Led the broadcast of school masses and home and away sports events, integrating wireless video systems, drone equipment, media servers, and audio across changing environments</w:t>
-      </w:r>
-    </w:p>
-    <w:p xmlns:wp14="http://schemas.microsoft.com/office/word/2010/wordml" wp14:textId="77777777">
-      <w:pPr>
-        <w:pStyle w:val="ListParagraph"/>
-        <w:numPr>
-          <w:ilvl w:val="0"/>
-          <w:numId w:val="2"/>
-        </w:numPr>
-        <w:spacing w:after="10" w:line="240"/>
-      </w:pPr>
-      <w:r>
-        <w:rPr>
-          <w:rFonts w:ascii="Calibri" w:hAnsi="Calibri" w:eastAsia="Calibri" w:cs="Calibri"/>
-          <w:sz w:val="21"/>
-          <w:szCs w:val="21"/>
-        </w:rPr>
-        <w:t xml:space="preserve">Solved real-time technical problems across signal, network, and equipment failures to ensure uninterrupted live broadcasts</w:t>
-      </w:r>
-    </w:p>
-    <w:p xmlns:wp14="http://schemas.microsoft.com/office/word/2010/wordml" wp14:textId="77777777">
-      <w:pPr>
-        <w:tabs>
-          <w:tab w:val="right" w:pos="10440"/>
-        </w:tabs>
-        <w:spacing w:before="60" w:after="0"/>
-      </w:pPr>
-      <w:r>
-        <w:rPr>
-          <w:rFonts w:ascii="Calibri" w:hAnsi="Calibri" w:eastAsia="Calibri" w:cs="Calibri"/>
-          <w:b/>
-          <w:bCs/>
-          <w:sz w:val="22"/>
-          <w:szCs w:val="22"/>
-        </w:rPr>
-        <w:t xml:space="preserve">Lead Programmer, Team Captain, and Driver</w:t>
-      </w:r>
-      <w:r>
-        <w:rPr>
-          <w:rFonts w:ascii="Calibri" w:hAnsi="Calibri" w:eastAsia="Calibri" w:cs="Calibri"/>
-          <w:sz w:val="22"/>
-          <w:szCs w:val="22"/>
-        </w:rPr>
-        <w:t xml:space="preserve">	</w:t>
-      </w:r>
-      <w:r>
-        <w:rPr>
-          <w:rFonts w:ascii="Calibri" w:hAnsi="Calibri" w:eastAsia="Calibri" w:cs="Calibri"/>
-          <w:i/>
-          <w:iCs/>
-          <w:sz w:val="22"/>
-          <w:szCs w:val="22"/>
-        </w:rPr>
-        <w:t xml:space="preserve">Fall 2021 – Spring 2025</w:t>
-      </w:r>
-    </w:p>
-    <w:p xmlns:wp14="http://schemas.microsoft.com/office/word/2010/wordml" wp14:textId="77777777">
-      <w:pPr>
-        <w:tabs>
-          <w:tab w:val="right" w:pos="10440"/>
-        </w:tabs>
-        <w:spacing w:after="10"/>
-      </w:pPr>
-      <w:r>
-        <w:rPr>
-          <w:rFonts w:ascii="Calibri" w:hAnsi="Calibri" w:eastAsia="Calibri" w:cs="Calibri"/>
-          <w:i/>
-          <w:iCs/>
-          <w:color w:val="404040"/>
-          <w:sz w:val="22"/>
-          <w:szCs w:val="22"/>
-        </w:rPr>
-        <w:t xml:space="preserve">FIRST FTC Robotics, Carmel Catholic High School</w:t>
-      </w:r>
-      <w:r>
-        <w:rPr>
-          <w:rFonts w:ascii="Calibri" w:hAnsi="Calibri" w:eastAsia="Calibri" w:cs="Calibri"/>
-          <w:sz w:val="22"/>
-          <w:szCs w:val="22"/>
-        </w:rPr>
-        <w:t xml:space="preserve">	</w:t>
-      </w:r>
-      <w:r>
-        <w:rPr>
-          <w:rFonts w:ascii="Calibri" w:hAnsi="Calibri" w:eastAsia="Calibri" w:cs="Calibri"/>
-          <w:color w:val="404040"/>
-          <w:sz w:val="22"/>
-          <w:szCs w:val="22"/>
-        </w:rPr>
-        <w:t xml:space="preserve">Mundelein, IL</w:t>
-      </w:r>
-    </w:p>
-    <w:p xmlns:wp14="http://schemas.microsoft.com/office/word/2010/wordml" wp14:textId="77777777">
-      <w:pPr>
-        <w:pStyle w:val="ListParagraph"/>
-        <w:numPr>
-          <w:ilvl w:val="0"/>
-          <w:numId w:val="2"/>
-        </w:numPr>
-        <w:spacing w:after="10" w:line="240"/>
-      </w:pPr>
-      <w:r>
-        <w:rPr>
-          <w:rFonts w:ascii="Calibri" w:hAnsi="Calibri" w:eastAsia="Calibri" w:cs="Calibri"/>
-          <w:sz w:val="21"/>
-          <w:szCs w:val="21"/>
-        </w:rPr>
-        <w:t xml:space="preserve">Served as programmer and driver in the first year, lead programmer for the following two, and lead programmer, team captain, driver, and mechanic in the final year; returned post-graduation as an alumni advisor</w:t>
-      </w:r>
-    </w:p>
-    <w:p xmlns:wp14="http://schemas.microsoft.com/office/word/2010/wordml" wp14:textId="77777777">
-      <w:pPr>
-        <w:pStyle w:val="ListParagraph"/>
-        <w:numPr>
-          <w:ilvl w:val="0"/>
-          <w:numId w:val="2"/>
-        </w:numPr>
-        <w:spacing w:after="10" w:line="240"/>
-      </w:pPr>
-      <w:r>
-        <w:rPr>
-          <w:rFonts w:ascii="Calibri" w:hAnsi="Calibri" w:eastAsia="Calibri" w:cs="Calibri"/>
-          <w:sz w:val="21"/>
-          <w:szCs w:val="21"/>
-        </w:rPr>
-        <w:t xml:space="preserve">Designed and implemented autonomous and teleoperated control software; led mechanical builds and team strategy across competitions</w:t>
-      </w:r>
-    </w:p>
-    <w:p xmlns:wp14="http://schemas.microsoft.com/office/word/2010/wordml" wp14:textId="77777777">
-      <w:pPr>
-        <w:tabs>
-          <w:tab w:val="right" w:pos="10440"/>
-        </w:tabs>
-        <w:spacing w:before="60" w:after="0"/>
-      </w:pPr>
-      <w:r>
-        <w:rPr>
-          <w:rFonts w:ascii="Calibri" w:hAnsi="Calibri" w:eastAsia="Calibri" w:cs="Calibri"/>
-          <w:b/>
-          <w:bCs/>
-          <w:sz w:val="22"/>
-          <w:szCs w:val="22"/>
-        </w:rPr>
-        <w:t xml:space="preserve">Sound Engineer</w:t>
-      </w:r>
-      <w:r>
-        <w:rPr>
-          <w:rFonts w:ascii="Calibri" w:hAnsi="Calibri" w:eastAsia="Calibri" w:cs="Calibri"/>
-          <w:sz w:val="22"/>
-          <w:szCs w:val="22"/>
-        </w:rPr>
-        <w:t xml:space="preserve">	</w:t>
-      </w:r>
-      <w:r>
-        <w:rPr>
-          <w:rFonts w:ascii="Calibri" w:hAnsi="Calibri" w:eastAsia="Calibri" w:cs="Calibri"/>
-          <w:i/>
-          <w:iCs/>
-          <w:sz w:val="22"/>
-          <w:szCs w:val="22"/>
-        </w:rPr>
-        <w:t xml:space="preserve">Sep 2023 – May 2025</w:t>
-      </w:r>
-    </w:p>
-    <w:p xmlns:wp14="http://schemas.microsoft.com/office/word/2010/wordml" wp14:textId="77777777">
-      <w:pPr>
-        <w:tabs>
-          <w:tab w:val="right" w:pos="10440"/>
-        </w:tabs>
-        <w:spacing w:after="10"/>
-      </w:pPr>
-      <w:r>
-        <w:rPr>
-          <w:rFonts w:ascii="Calibri" w:hAnsi="Calibri" w:eastAsia="Calibri" w:cs="Calibri"/>
-          <w:i/>
-          <w:iCs/>
-          <w:color w:val="404040"/>
-          <w:sz w:val="22"/>
-          <w:szCs w:val="22"/>
-        </w:rPr>
-        <w:t xml:space="preserve">Carmel Catholic High School</w:t>
-      </w:r>
-      <w:r>
-        <w:rPr>
-          <w:rFonts w:ascii="Calibri" w:hAnsi="Calibri" w:eastAsia="Calibri" w:cs="Calibri"/>
-          <w:sz w:val="22"/>
-          <w:szCs w:val="22"/>
-        </w:rPr>
-        <w:t xml:space="preserve">	</w:t>
-      </w:r>
-      <w:r>
-        <w:rPr>
-          <w:rFonts w:ascii="Calibri" w:hAnsi="Calibri" w:eastAsia="Calibri" w:cs="Calibri"/>
-          <w:color w:val="404040"/>
-          <w:sz w:val="22"/>
-          <w:szCs w:val="22"/>
-        </w:rPr>
-        <w:t xml:space="preserve">Mundelein, IL</w:t>
-      </w:r>
-    </w:p>
-    <w:p xmlns:wp14="http://schemas.microsoft.com/office/word/2010/wordml" wp14:textId="77777777">
-      <w:pPr>
-        <w:pStyle w:val="ListParagraph"/>
-        <w:numPr>
-          <w:ilvl w:val="0"/>
-          <w:numId w:val="2"/>
-        </w:numPr>
-        <w:spacing w:after="10" w:line="240"/>
-      </w:pPr>
-      <w:r>
-        <w:rPr>
-          <w:rFonts w:ascii="Calibri" w:hAnsi="Calibri" w:eastAsia="Calibri" w:cs="Calibri"/>
-          <w:sz w:val="21"/>
-          <w:szCs w:val="21"/>
-        </w:rPr>
-        <w:t xml:space="preserve">Designed and installed sound systems for events across the Carmel Catholic Auditorium and Salvi Arena; provided live sound engineering for performances, concerts, plays, and assemblies</w:t>
-      </w:r>
-    </w:p>
-    <w:p xmlns:wp14="http://schemas.microsoft.com/office/word/2010/wordml" wp14:textId="77777777">
-      <w:pPr>
-        <w:tabs>
-          <w:tab w:val="right" w:pos="10440"/>
-        </w:tabs>
-        <w:spacing w:before="60" w:after="0"/>
-      </w:pPr>
-      <w:r>
-        <w:rPr>
-          <w:rFonts w:ascii="Calibri" w:hAnsi="Calibri" w:eastAsia="Calibri" w:cs="Calibri"/>
-          <w:b/>
-          <w:bCs/>
-          <w:sz w:val="22"/>
-          <w:szCs w:val="22"/>
-        </w:rPr>
-        <w:t xml:space="preserve">Beach Manager</w:t>
-      </w:r>
-      <w:r>
-        <w:rPr>
-          <w:rFonts w:ascii="Calibri" w:hAnsi="Calibri" w:eastAsia="Calibri" w:cs="Calibri"/>
-          <w:sz w:val="22"/>
-          <w:szCs w:val="22"/>
-        </w:rPr>
-        <w:t xml:space="preserve">	</w:t>
-      </w:r>
-      <w:r>
-        <w:rPr>
-          <w:rFonts w:ascii="Calibri" w:hAnsi="Calibri" w:eastAsia="Calibri" w:cs="Calibri"/>
-          <w:i/>
-          <w:iCs/>
-          <w:sz w:val="22"/>
-          <w:szCs w:val="22"/>
-        </w:rPr>
-        <w:t xml:space="preserve">May 2026 – Aug 2026</w:t>
-      </w:r>
-    </w:p>
-    <w:p xmlns:wp14="http://schemas.microsoft.com/office/word/2010/wordml" wp14:textId="77777777">
-      <w:pPr>
-        <w:tabs>
-          <w:tab w:val="right" w:pos="10440"/>
-        </w:tabs>
-        <w:spacing w:after="10"/>
-      </w:pPr>
-      <w:r>
-        <w:rPr>
-          <w:rFonts w:ascii="Calibri" w:hAnsi="Calibri" w:eastAsia="Calibri" w:cs="Calibri"/>
-          <w:i/>
-          <w:iCs/>
-          <w:color w:val="404040"/>
-          <w:sz w:val="22"/>
-          <w:szCs w:val="22"/>
-        </w:rPr>
-        <w:t xml:space="preserve">City of Waukegan, Waukegan Municipal Beach</w:t>
-      </w:r>
-      <w:r>
-        <w:rPr>
-          <w:rFonts w:ascii="Calibri" w:hAnsi="Calibri" w:eastAsia="Calibri" w:cs="Calibri"/>
-          <w:sz w:val="22"/>
-          <w:szCs w:val="22"/>
-        </w:rPr>
-        <w:t xml:space="preserve">	</w:t>
-      </w:r>
-      <w:r>
-        <w:rPr>
-          <w:rFonts w:ascii="Calibri" w:hAnsi="Calibri" w:eastAsia="Calibri" w:cs="Calibri"/>
-          <w:color w:val="404040"/>
-          <w:sz w:val="22"/>
-          <w:szCs w:val="22"/>
-        </w:rPr>
-        <w:t xml:space="preserve">Waukegan, IL</w:t>
-      </w:r>
-    </w:p>
-    <w:p xmlns:wp14="http://schemas.microsoft.com/office/word/2010/wordml" wp14:textId="77777777">
-      <w:pPr>
-        <w:pStyle w:val="ListParagraph"/>
-        <w:numPr>
-          <w:ilvl w:val="0"/>
-          <w:numId w:val="2"/>
-        </w:numPr>
-        <w:spacing w:after="10" w:line="240"/>
-      </w:pPr>
-      <w:r>
-        <w:rPr>
-          <w:rFonts w:ascii="Calibri" w:hAnsi="Calibri" w:eastAsia="Calibri" w:cs="Calibri"/>
-          <w:sz w:val="21"/>
-          <w:szCs w:val="21"/>
-        </w:rPr>
         <w:t xml:space="preserve">Promoted from Beach Ranger; scheduled and delegated tasks across beach staff, coordinating daily coverage and responsibilities</w:t>
       </w:r>
     </w:p>
@@ -974,7 +616,7 @@
     </w:p>
     <w:sectPr>
       <w:pgSz w:w="12240" w:h="15840" w:orient="portrait"/>
-      <w:pgMar w:top="220" w:right="900" w:bottom="220" w:left="900" w:header="708" w:footer="708" w:gutter="0"/>
+      <w:pgMar w:top="1440" w:right="1440" w:bottom="1440" w:left="1440" w:header="708" w:footer="708" w:gutter="0"/>
       <w:pgNumType/>
       <w:docGrid w:linePitch="360"/>
       <w:cols w:num="1"/>

</xml_diff>

<commit_message>
Expand iKB and JACK project bullets to four points each
Each project now has four bullets in action-verb > what > how order,
most impactful first, drawn from the tech stack already listed for
each project (retrieval pipeline, Contextual Retrieval, browser
extension/SSO, and deployment for iKB; intent routing, dependency
resolution, dynamic capabilities, and response compilation for JACK).

Co-Authored-By: Claude Sonnet 5 <noreply@anthropic.com>
Claude-Session: https://claude.ai/code/session_0186boHx8eujw37m6nFR9HbD
</commit_message>
<xml_diff>
--- a/Alejandro Escamilla - Resume.docx
+++ b/Alejandro Escamilla - Resume.docx
@@ -240,7 +240,7 @@
           <w:szCs w:val="21"/>
           <w:lang w:val="en-US"/>
         </w:rPr>
-        <w:t>Built a hybrid retrieval pipeline combining Voyage AI embeddings, BM25 lexical search, and Anthropic’s Contextual Retrieval for high-relevance knowledge base queries</w:t>
+        <w:t>Built a hybrid retrieval pipeline combining Voyage AI embeddings and BM25 lexical search, storing vectors in sqlite-vec for fast, high-relevance knowledge base queries</w:t>
       </w:r>
     </w:p>
     <w:p xmlns:wp14="http://schemas.microsoft.com/office/word/2010/wordml" wp14:textId="77777777">
@@ -260,7 +260,47 @@
           <w:szCs w:val="21"/>
           <w:lang w:val="en-US"/>
         </w:rPr>
-        <w:t>Developed a cross-browser extension (Chrome MV3 and Firefox) handling Cerebro SSO authentication via postMessage, allowing the tool to integrate directly into IT staff workflows</w:t>
+        <w:t>Boosted retrieval accuracy on ambiguous queries by implementing Anthropic’s Contextual Retrieval technique, using the Claude API to prepend chunk-specific context before indexing</w:t>
+      </w:r>
+    </w:p>
+    <w:p xmlns:wp14="http://schemas.microsoft.com/office/word/2010/wordml" wp14:textId="77777777">
+      <w:pPr>
+        <w:pStyle w:val="ListParagraph"/>
+        <w:numPr>
+          <w:ilvl w:val="0"/>
+          <w:numId w:val="2"/>
+        </w:numPr>
+        <w:spacing w:after="10" w:line="240" w:lineRule="auto"/>
+        <w:rPr/>
+      </w:pPr>
+      <w:r>
+        <w:rPr>
+          <w:rFonts w:ascii="Calibri" w:hAnsi="Calibri" w:eastAsia="Calibri" w:cs="Calibri"/>
+          <w:sz w:val="21"/>
+          <w:szCs w:val="21"/>
+          <w:lang w:val="en-US"/>
+        </w:rPr>
+        <w:t>Developed a cross-browser extension (Chrome MV3 and Firefox) handling Cerebro SSO authentication via postMessage, integrating the tool directly into IT staff workflows</w:t>
+      </w:r>
+    </w:p>
+    <w:p xmlns:wp14="http://schemas.microsoft.com/office/word/2010/wordml" wp14:textId="77777777">
+      <w:pPr>
+        <w:pStyle w:val="ListParagraph"/>
+        <w:numPr>
+          <w:ilvl w:val="0"/>
+          <w:numId w:val="2"/>
+        </w:numPr>
+        <w:spacing w:after="10" w:line="240" w:lineRule="auto"/>
+        <w:rPr/>
+      </w:pPr>
+      <w:r>
+        <w:rPr>
+          <w:rFonts w:ascii="Calibri" w:hAnsi="Calibri" w:eastAsia="Calibri" w:cs="Calibri"/>
+          <w:sz w:val="21"/>
+          <w:szCs w:val="21"/>
+          <w:lang w:val="en-US"/>
+        </w:rPr>
+        <w:t>Deployed the Flask backend to Azure App Service, structuring the API to serve search and embedding requests for production use</w:t>
       </w:r>
     </w:p>
     <w:p xmlns:wp14="http://schemas.microsoft.com/office/word/2010/wordml" wp14:textId="77777777">
@@ -343,7 +383,7 @@
           <w:sz w:val="21"/>
           <w:szCs w:val="21"/>
         </w:rPr>
-        <w:t xml:space="preserve">Designed an internal router, backed by a Claude agent, that decomposes user input into discrete intents with parameter extraction, resolves inter-task dependencies, and produces an execution queue</w:t>
+        <w:t xml:space="preserve">Designed a Claude-agent-backed router that decomposes free-form voice input into discrete intents, extracting parameters for each identified action</w:t>
       </w:r>
     </w:p>
     <w:p xmlns:wp14="http://schemas.microsoft.com/office/word/2010/wordml" wp14:textId="77777777">
@@ -361,7 +401,43 @@
           <w:sz w:val="21"/>
           <w:szCs w:val="21"/>
         </w:rPr>
-        <w:t xml:space="preserve">Architected dynamic capability generation and compound command handling, with a final Claude agent compiling execution results into a single coherent spoken response</w:t>
+        <w:t xml:space="preserve">Built a dependency-resolution engine that sequences interdependent intents into an ordered execution queue, enabling accurate multi-step voice commands</w:t>
+      </w:r>
+    </w:p>
+    <w:p xmlns:wp14="http://schemas.microsoft.com/office/word/2010/wordml" wp14:textId="77777777">
+      <w:pPr>
+        <w:pStyle w:val="ListParagraph"/>
+        <w:numPr>
+          <w:ilvl w:val="0"/>
+          <w:numId w:val="2"/>
+        </w:numPr>
+        <w:spacing w:after="10" w:line="240"/>
+      </w:pPr>
+      <w:r>
+        <w:rPr>
+          <w:rFonts w:ascii="Calibri" w:hAnsi="Calibri" w:eastAsia="Calibri" w:cs="Calibri"/>
+          <w:sz w:val="21"/>
+          <w:szCs w:val="21"/>
+        </w:rPr>
+        <w:t xml:space="preserve">Architected a dynamic capability generation system that extends the assistant’s available actions at runtime, avoiding hardcoded per-command handlers</w:t>
+      </w:r>
+    </w:p>
+    <w:p xmlns:wp14="http://schemas.microsoft.com/office/word/2010/wordml" wp14:textId="77777777">
+      <w:pPr>
+        <w:pStyle w:val="ListParagraph"/>
+        <w:numPr>
+          <w:ilvl w:val="0"/>
+          <w:numId w:val="2"/>
+        </w:numPr>
+        <w:spacing w:after="10" w:line="240"/>
+      </w:pPr>
+      <w:r>
+        <w:rPr>
+          <w:rFonts w:ascii="Calibri" w:hAnsi="Calibri" w:eastAsia="Calibri" w:cs="Calibri"/>
+          <w:sz w:val="21"/>
+          <w:szCs w:val="21"/>
+        </w:rPr>
+        <w:t xml:space="preserve">Implemented compound command handling with a dedicated Claude agent, compiling multiple execution results into a single coherent spoken response</w:t>
       </w:r>
     </w:p>
     <w:p xmlns:wp14="http://schemas.microsoft.com/office/word/2010/wordml" wp14:textId="77777777">

</xml_diff>

<commit_message>
Add date ranges to iKB and JACK project entries
Replace the "In Development" labels with Month YYYY - Present ranges,
sourced from each project's actual GitHub history:
- iKB (IntelligentKB): first commit March 2026
- JACK: first commit December 2025, in the JACKv1 repo (the project
  continued into a JACKv2/v3 rewrite starting the same day JACKv1's
  last commit landed, so the two are treated as one continuous project)

Co-Authored-By: Claude Sonnet 5 <noreply@anthropic.com>
Claude-Session: https://claude.ai/code/session_0186boHx8eujw37m6nFR9HbD
</commit_message>
<xml_diff>
--- a/Alejandro Escamilla - Resume.docx
+++ b/Alejandro Escamilla - Resume.docx
@@ -145,11 +145,14 @@
         <w:t>iKB (IntelligentKB) — AI-Powered Knowledge Base Search Tool</w:t>
       </w:r>
       <w:r>
+        <w:tab/>
+      </w:r>
+      <w:r>
         <w:rPr>
           <w:i/>
           <w:iCs/>
         </w:rPr>
-        <w:t>In Development</w:t>
+        <w:t>Mar 2026 – Present</w:t>
       </w:r>
     </w:p>
     <w:p>
@@ -251,11 +254,14 @@
         <w:t>JACK — Real-Time Voice-First AI Assistant</w:t>
       </w:r>
       <w:r>
+        <w:tab/>
+      </w:r>
+      <w:r>
         <w:rPr>
           <w:i/>
           <w:iCs/>
         </w:rPr>
-        <w:t>In Development</w:t>
+        <w:t>Dec 2025 – Present</w:t>
       </w:r>
     </w:p>
     <w:p>

</xml_diff>

<commit_message>
Trim skills section and expand Beach Manager role
- Remove French from spoken languages
- Rename "SKILLS & LANGUAGES" header to "SKILLS"
- Expand the single Beach Manager bullet into four, covering the
  911-response pier-marker safety initiative, the promotion and
  staff scheduling, training/onboarding, and visitor-facing duties
  with CPR/First Aid certification

Co-Authored-By: Claude Sonnet 5 <noreply@anthropic.com>
Claude-Session: https://claude.ai/code/session_0186boHx8eujw37m6nFR9HbD
</commit_message>
<xml_diff>
--- a/Alejandro Escamilla - Resume.docx
+++ b/Alejandro Escamilla - Resume.docx
@@ -498,7 +498,58 @@
           <w:sz w:val="21"/>
           <w:szCs w:val="21"/>
         </w:rPr>
-        <w:t>Promoted from Beach Ranger; scheduled and delegated tasks across beach staff, coordinating daily coverage and responsibilities</w:t>
+        <w:t>Directed a staff-led initiative that installed identifying markers at each of the beach’s three piers, cutting 911 dispatch response times by giving callers a precise location to report</w:t>
+      </w:r>
+    </w:p>
+    <w:p>
+      <w:pPr>
+        <w:pStyle w:val="ListParagraph"/>
+        <w:numPr>
+          <w:ilvl w:val="0"/>
+          <w:numId w:val="2"/>
+        </w:numPr>
+        <w:spacing w:after="10"/>
+      </w:pPr>
+      <w:r>
+        <w:rPr>
+          <w:sz w:val="21"/>
+          <w:szCs w:val="21"/>
+        </w:rPr>
+        <w:t>Promoted from Beach Ranger to Beach Manager; scheduled and delegated daily tasks across a staff of 6–15, ensuring consistent coverage across all beach operations</w:t>
+      </w:r>
+    </w:p>
+    <w:p>
+      <w:pPr>
+        <w:pStyle w:val="ListParagraph"/>
+        <w:numPr>
+          <w:ilvl w:val="0"/>
+          <w:numId w:val="2"/>
+        </w:numPr>
+        <w:spacing w:after="10"/>
+      </w:pPr>
+      <w:r>
+        <w:rPr>
+          <w:sz w:val="21"/>
+          <w:szCs w:val="21"/>
+        </w:rPr>
+        <w:t>Trained and onboarded new beach staff on safety protocols, customer service standards, and facility and equipment procedures</w:t>
+      </w:r>
+    </w:p>
+    <w:p>
+      <w:pPr>
+        <w:pStyle w:val="ListParagraph"/>
+        <w:numPr>
+          <w:ilvl w:val="0"/>
+          <w:numId w:val="2"/>
+        </w:numPr>
+        <w:spacing w:after="10"/>
+      </w:pPr>
+      <w:r>
+        <w:rPr>
+          <w:sz w:val="21"/>
+          <w:szCs w:val="21"/>
+        </w:rPr>
+        <w:t>Served as the primary point of contact for visitor questions and concerns, maintaining CPR/First Aid certification to respond to on-site medical situations</w:t>
       </w:r>
     </w:p>
     <w:p>
@@ -515,7 +566,7 @@
           <w:color w:val="1A1A1A"/>
           <w:spacing w:val="20"/>
         </w:rPr>
-        <w:t>SKILLS &amp; LANGUAGES</w:t>
+        <w:t>SKILLS</w:t>
       </w:r>
     </w:p>
     <w:p>
@@ -551,7 +602,7 @@
           <w:sz w:val="20"/>
           <w:szCs w:val="20"/>
         </w:rPr>
-        <w:t>English (native), Spanish (heritage), French (intermediate)</w:t>
+        <w:t>English (native), Spanish (heritage)</w:t>
       </w:r>
     </w:p>
     <w:sectPr>

</xml_diff>

<commit_message>
Clarify Lakefront Department affiliation and pier-marker project origin
- Note the City of Waukegan Lakefront Department as the organizational
  unit for the Beach Manager role
- Correct the pier-marker safety bullet: the initiative was commissioned
  by the City Council, not staff-led; the bullet now credits directing
  its on-site execution rather than originating it

Co-Authored-By: Claude Sonnet 5 <noreply@anthropic.com>
Claude-Session: https://claude.ai/code/session_0186boHx8eujw37m6nFR9HbD
</commit_message>
<xml_diff>
--- a/Alejandro Escamilla - Resume.docx
+++ b/Alejandro Escamilla - Resume.docx
@@ -481,7 +481,7 @@
           <w:iCs/>
           <w:color w:val="404040"/>
         </w:rPr>
-        <w:t>City of Waukegan, Waukegan Municipal Beach</w:t>
+        <w:t>City of Waukegan Lakefront Department, Waukegan Municipal Beach</w:t>
       </w:r>
     </w:p>
     <w:p>
@@ -498,7 +498,7 @@
           <w:sz w:val="21"/>
           <w:szCs w:val="21"/>
         </w:rPr>
-        <w:t>Directed a staff-led initiative that installed identifying markers at each of the beach’s three piers, cutting 911 dispatch response times by giving callers a precise location to report</w:t>
+        <w:t>Directed the on-site execution of a City Council-commissioned safety initiative, installing identifying markers at each of the beach’s three piers to cut 911 dispatch response times</w:t>
       </w:r>
     </w:p>
     <w:p>

</xml_diff>

<commit_message>
Swap org/position order in Professional Experience entries
Organization now leads (bold, with date range), with job title as the
italic subtext line below, for both Help Desk Student Consultant and
Beach Manager.

Co-Authored-By: Claude Sonnet 5 <noreply@anthropic.com>
Claude-Session: https://claude.ai/code/session_0186boHx8eujw37m6nFR9HbD
</commit_message>
<xml_diff>
--- a/Alejandro Escamilla - Resume.docx
+++ b/Alejandro Escamilla - Resume.docx
@@ -380,7 +380,7 @@
           <w:b/>
           <w:bCs/>
         </w:rPr>
-        <w:t>Help Desk Student Consultant</w:t>
+        <w:t>University of Illinois Technology Services</w:t>
       </w:r>
       <w:r>
         <w:tab/>
@@ -406,7 +406,7 @@
           <w:iCs/>
           <w:color w:val="404040"/>
         </w:rPr>
-        <w:t>University of Illinois Technology Services</w:t>
+        <w:t>Help Desk Student Consultant</w:t>
       </w:r>
     </w:p>
     <w:p>
@@ -455,7 +455,7 @@
           <w:b/>
           <w:bCs/>
         </w:rPr>
-        <w:t>Beach Manager</w:t>
+        <w:t>Waukegan Municipal Beach</w:t>
       </w:r>
       <w:r>
         <w:tab/>
@@ -481,7 +481,7 @@
           <w:iCs/>
           <w:color w:val="404040"/>
         </w:rPr>
-        <w:t>Waukegan Municipal Beach</w:t>
+        <w:t>Beach Manager</w:t>
       </w:r>
     </w:p>
     <w:p>

</xml_diff>

<commit_message>
Tighten the longest bullets to help the resume fit one page
Shorten the 14 longest project and experience bullets (all were
120-181 characters and wrapping to two lines) down to roughly
85-120 characters each, preserving every key fact, technology, and
number. The GPA line is left untouched per feedback.

Co-Authored-By: Claude Sonnet 5 <noreply@anthropic.com>
Claude-Session: https://claude.ai/code/session_0186boHx8eujw37m6nFR9HbD
</commit_message>
<xml_diff>
--- a/Alejandro Escamilla - Resume.docx
+++ b/Alejandro Escamilla - Resume.docx
@@ -185,7 +185,7 @@
           <w:sz w:val="21"/>
           <w:szCs w:val="21"/>
         </w:rPr>
-        <w:t>Built a hybrid retrieval pipeline combining Voyage AI embeddings and BM25 lexical search, storing vectors in sqlite-vec for fast, high-relevance knowledge base queries</w:t>
+        <w:t>Combined Voyage AI embeddings and BM25 lexical search in a hybrid retrieval pipeline backed by sqlite-vec</w:t>
       </w:r>
     </w:p>
     <w:p>
@@ -202,7 +202,7 @@
           <w:sz w:val="21"/>
           <w:szCs w:val="21"/>
         </w:rPr>
-        <w:t>Boosted retrieval accuracy on ambiguous queries by implementing Anthropic’s Contextual Retrieval technique, using the Claude API to prepend chunk-specific context before indexing</w:t>
+        <w:t>Boosted accuracy via Anthropic’s Contextual Retrieval, prepending Claude-generated context before indexing</w:t>
       </w:r>
     </w:p>
     <w:p>
@@ -219,7 +219,7 @@
           <w:sz w:val="21"/>
           <w:szCs w:val="21"/>
         </w:rPr>
-        <w:t>Developed a cross-browser extension (Chrome MV3 and Firefox) handling Cerebro SSO authentication via postMessage, integrating the tool directly into IT staff workflows</w:t>
+        <w:t>Built a Chrome/Firefox extension handling Cerebro SSO via postMessage, integrating into IT workflows</w:t>
       </w:r>
     </w:p>
     <w:p>
@@ -236,7 +236,7 @@
           <w:sz w:val="21"/>
           <w:szCs w:val="21"/>
         </w:rPr>
-        <w:t>Deployed the Flask backend to Azure App Service, structuring the API to serve search and embedding requests for production use</w:t>
+        <w:t>Deployed the Flask backend to Azure App Service to serve search and embedding requests in production</w:t>
       </w:r>
     </w:p>
     <w:p>
@@ -297,7 +297,7 @@
           <w:sz w:val="21"/>
           <w:szCs w:val="21"/>
         </w:rPr>
-        <w:t>Designed a Claude-agent-backed router that decomposes free-form voice input into discrete intents, extracting parameters for each identified action</w:t>
+        <w:t>Designed a Claude-backed router that decomposes voice input into intents with parameter extraction</w:t>
       </w:r>
     </w:p>
     <w:p>
@@ -314,7 +314,7 @@
           <w:sz w:val="21"/>
           <w:szCs w:val="21"/>
         </w:rPr>
-        <w:t>Built a dependency-resolution engine that sequences interdependent intents into an ordered execution queue, enabling accurate multi-step voice commands</w:t>
+        <w:t>Built a dependency-resolution engine sequencing intents into an execution queue for multi-step commands</w:t>
       </w:r>
     </w:p>
     <w:p>
@@ -331,7 +331,7 @@
           <w:sz w:val="21"/>
           <w:szCs w:val="21"/>
         </w:rPr>
-        <w:t>Architected a dynamic capability generation system that extends the assistant’s available actions at runtime, avoiding hardcoded per-command handlers</w:t>
+        <w:t>Architected dynamic capability generation, extending the assistant’s actions at runtime without hardcoded handlers</w:t>
       </w:r>
     </w:p>
     <w:p>
@@ -348,7 +348,7 @@
           <w:sz w:val="21"/>
           <w:szCs w:val="21"/>
         </w:rPr>
-        <w:t>Implemented compound command handling with a dedicated Claude agent, compiling multiple execution results into a single coherent spoken response</w:t>
+        <w:t>Implemented compound command handling, using a Claude agent to compile results into one spoken response</w:t>
       </w:r>
     </w:p>
     <w:p>
@@ -423,7 +423,7 @@
           <w:sz w:val="21"/>
           <w:szCs w:val="21"/>
         </w:rPr>
-        <w:t>Provide Tier 1 technical support to students, faculty, and staff across university-managed services, including UIUC accounts, campus network access, and Microsoft 365</w:t>
+        <w:t>Provide Tier 1 support for UIUC accounts, campus network access, and Microsoft 365 across university services</w:t>
       </w:r>
     </w:p>
     <w:p>
@@ -440,7 +440,7 @@
           <w:sz w:val="21"/>
           <w:szCs w:val="21"/>
         </w:rPr>
-        <w:t>Troubleshoot connectivity, authentication, and software issues across a wide range of technical backgrounds, escalating complex tickets to Tier 2 with thorough documentation</w:t>
+        <w:t>Troubleshoot connectivity, authentication, and software issues, escalating complex tickets to Tier 2 with documentation</w:t>
       </w:r>
     </w:p>
     <w:p>
@@ -498,7 +498,7 @@
           <w:sz w:val="21"/>
           <w:szCs w:val="21"/>
         </w:rPr>
-        <w:t>Directed the on-site execution of a City Council-commissioned safety initiative, installing identifying markers at each of the beach’s three piers to cut 911 dispatch response times</w:t>
+        <w:t>Directed a City Council-mandated initiative installing pier ID markers, cutting 911 response times</w:t>
       </w:r>
     </w:p>
     <w:p>
@@ -515,7 +515,7 @@
           <w:sz w:val="21"/>
           <w:szCs w:val="21"/>
         </w:rPr>
-        <w:t>Promoted from Beach Ranger to Beach Manager; scheduled and delegated daily tasks across a staff of 6–15, ensuring consistent coverage across all beach operations</w:t>
+        <w:t>Promoted from Beach Ranger to Beach Manager; scheduled and delegated daily tasks across a staff of 6–15</w:t>
       </w:r>
     </w:p>
     <w:p>
@@ -532,7 +532,7 @@
           <w:sz w:val="21"/>
           <w:szCs w:val="21"/>
         </w:rPr>
-        <w:t>Trained and onboarded new beach staff on safety protocols, customer service standards, and facility and equipment procedures</w:t>
+        <w:t>Trained and onboarded new staff on safety, customer service, and facility procedures</w:t>
       </w:r>
     </w:p>
     <w:p>
@@ -549,7 +549,7 @@
           <w:sz w:val="21"/>
           <w:szCs w:val="21"/>
         </w:rPr>
-        <w:t>Served as the primary point of contact for visitor questions and concerns, maintaining CPR/First Aid certification to respond to on-site medical situations</w:t>
+        <w:t>Served as the primary contact for visitor concerns, maintaining CPR/First Aid certification for on-site emergencies</w:t>
       </w:r>
     </w:p>
     <w:p>

</xml_diff>